<commit_message>
Fix reference numbering to Nature order-of-first-appearance
References were grouped thematically, so high numbers appeared before
low ones in the text. Citations are now keyed by name and numbered
automatically on first appearance, with runs of three or more collapsed
into en-dash ranges, and the reference list emitted in that same order.

Co-Authored-By: Claude Opus 5.5 <noreply@anthropic.com>
Claude-Session: https://claude.ai/code/session_016iYNRvycXrAsZAWm2v4tzv
</commit_message>
<xml_diff>
--- a/Nilsson_five_questions_Josyula.docx
+++ b/Nilsson_five_questions_Josyula.docx
@@ -43,9 +43,6 @@
       </w:r>
     </w:p>
     <w:p>
-      <w:pPr>
-        <w:spacing w:before="0"/>
-      </w:pPr>
       <w:r>
         <w:t>Each question below is selected on one criterion: it is open because of a measurement limit rather than a lack of interest, so the method follows from the question instead of preceding it. Tissue settings are restricted to material the lab has published on, principally colorectal liver metastases with their established zonation</w:t>
       </w:r>
@@ -53,7 +50,7 @@
         <w:rPr>
           <w:vertAlign w:val="superscript"/>
         </w:rPr>
-        <w:t>7,8</w:t>
+        <w:t>1,2</w:t>
       </w:r>
       <w:r>
         <w:t>, colorectal and breast primaries</w:t>
@@ -62,7 +59,7 @@
         <w:rPr>
           <w:vertAlign w:val="superscript"/>
         </w:rPr>
-        <w:t>10</w:t>
+        <w:t>3</w:t>
       </w:r>
       <w:r>
         <w:t>, and multiple sclerosis lesions and human cortex on the CNS side</w:t>
@@ -71,7 +68,7 @@
         <w:rPr>
           <w:vertAlign w:val="superscript"/>
         </w:rPr>
-        <w:t>12,13</w:t>
+        <w:t>4,5</w:t>
       </w:r>
       <w:r>
         <w:t>. Questions are ordered by what I would pitch first, not by ambition.</w:t>
@@ -93,7 +90,6 @@
     <w:p>
       <w:pPr>
         <w:spacing w:after="100"/>
-        <w:ind w:left="0"/>
       </w:pPr>
       <w:r>
         <w:rPr>
@@ -108,7 +104,7 @@
         <w:rPr>
           <w:vertAlign w:val="superscript"/>
         </w:rPr>
-        <w:t>24,25</w:t>
+        <w:t>6,7</w:t>
       </w:r>
       <w:r>
         <w:t>. Sympathetic signalling drives CD8 T cell exhaustion through ADRB1, with exhausted cells clustering around sympathetic fibres</w:t>
@@ -117,7 +113,7 @@
         <w:rPr>
           <w:vertAlign w:val="superscript"/>
         </w:rPr>
-        <w:t>22</w:t>
+        <w:t>8</w:t>
       </w:r>
       <w:r>
         <w:t>; nociceptor neurons suppress immunosurveillance</w:t>
@@ -126,7 +122,7 @@
         <w:rPr>
           <w:vertAlign w:val="superscript"/>
         </w:rPr>
-        <w:t>20,21</w:t>
+        <w:t>9,10</w:t>
       </w:r>
       <w:r>
         <w:t>; and adrenergic and neurotrophin circuits accelerate progression in prostate and pancreatic models</w:t>
@@ -135,7 +131,7 @@
         <w:rPr>
           <w:vertAlign w:val="superscript"/>
         </w:rPr>
-        <w:t>17,18,19</w:t>
+        <w:t>11–13</w:t>
       </w:r>
       <w:r>
         <w:t>.</w:t>
@@ -144,7 +140,6 @@
     <w:p>
       <w:pPr>
         <w:spacing w:after="100"/>
-        <w:ind w:left="0"/>
       </w:pPr>
       <w:r>
         <w:rPr>
@@ -159,7 +154,6 @@
     <w:p>
       <w:pPr>
         <w:spacing w:after="100"/>
-        <w:ind w:left="0"/>
       </w:pPr>
       <w:r>
         <w:rPr>
@@ -174,7 +168,7 @@
         <w:rPr>
           <w:vertAlign w:val="superscript"/>
         </w:rPr>
-        <w:t>3,5,6</w:t>
+        <w:t>14–16</w:t>
       </w:r>
       <w:r>
         <w:t xml:space="preserve"> on colorectal primaries and liver metastases in which perineural invasion is routinely scored, anchored to the desmoplastic rim zonation already established in this material</w:t>
@@ -183,7 +177,7 @@
         <w:rPr>
           <w:vertAlign w:val="superscript"/>
         </w:rPr>
-        <w:t>7,8</w:t>
+        <w:t>1,2</w:t>
       </w:r>
       <w:r>
         <w:t>, with panel modules for neuronal and Schwann identity, myeloid state and T cell function. Spatially resolved clonotyping asks whether T cell clones near nerves are expanded or excluded</w:t>
@@ -192,7 +186,7 @@
         <w:rPr>
           <w:vertAlign w:val="superscript"/>
         </w:rPr>
-        <w:t>9</w:t>
+        <w:t>17</w:t>
       </w:r>
       <w:r>
         <w:t>. Because apposition is currently inferred from segmentation, the limiting step is measuring it: splitting padlock arms across two cell surfaces so that circularisation is conditional on contact extends the proximity principle of in situ proximity ligation</w:t>
@@ -201,7 +195,7 @@
         <w:rPr>
           <w:vertAlign w:val="superscript"/>
         </w:rPr>
-        <w:t>4</w:t>
+        <w:t>18</w:t>
       </w:r>
       <w:r>
         <w:t xml:space="preserve"> using established padlock and rolling-circle chemistry</w:t>
@@ -210,7 +204,7 @@
         <w:rPr>
           <w:vertAlign w:val="superscript"/>
         </w:rPr>
-        <w:t>1,2</w:t>
+        <w:t>19,20</w:t>
       </w:r>
       <w:r>
         <w:t>. The uninvaded nerves in the same section are the internal control.</w:t>
@@ -219,7 +213,6 @@
     <w:p>
       <w:pPr>
         <w:spacing w:after="100"/>
-        <w:ind w:left="0"/>
       </w:pPr>
       <w:r>
         <w:rPr>
@@ -234,7 +227,7 @@
         <w:rPr>
           <w:vertAlign w:val="superscript"/>
         </w:rPr>
-        <w:t>24</w:t>
+        <w:t>6</w:t>
       </w:r>
       <w:r>
         <w:t>.</w:t>
@@ -256,7 +249,6 @@
     <w:p>
       <w:pPr>
         <w:spacing w:after="100"/>
-        <w:ind w:left="0"/>
       </w:pPr>
       <w:r>
         <w:rPr>
@@ -271,7 +263,7 @@
         <w:rPr>
           <w:vertAlign w:val="superscript"/>
         </w:rPr>
-        <w:t>30</w:t>
+        <w:t>21</w:t>
       </w:r>
       <w:r>
         <w:t>. Macrophage identity is understood to arise from the combination of ontogeny and niche instruction, and which of the two dominates differs between tissues.</w:t>
@@ -280,7 +272,6 @@
     <w:p>
       <w:pPr>
         <w:spacing w:after="100"/>
-        <w:ind w:left="0"/>
       </w:pPr>
       <w:r>
         <w:rPr>
@@ -295,7 +286,6 @@
     <w:p>
       <w:pPr>
         <w:spacing w:after="100"/>
-        <w:ind w:left="0"/>
       </w:pPr>
       <w:r>
         <w:rPr>
@@ -310,7 +300,7 @@
         <w:rPr>
           <w:vertAlign w:val="superscript"/>
         </w:rPr>
-        <w:t>2</w:t>
+        <w:t>20</w:t>
       </w:r>
       <w:r>
         <w:t>, and spatial genomics reads clonal structure in tumour tissue</w:t>
@@ -319,7 +309,7 @@
         <w:rPr>
           <w:vertAlign w:val="superscript"/>
         </w:rPr>
-        <w:t>11</w:t>
+        <w:t>22</w:t>
       </w:r>
       <w:r>
         <w:t>; extending this to fate-mapping alleles and to mitochondrial haplotypes makes lineage and state co-readable. Mouse material establishes the readout where ontogeny is known by construction; human tumour material then tests whether the same population exists.</w:t>
@@ -328,7 +318,6 @@
     <w:p>
       <w:pPr>
         <w:spacing w:after="100"/>
-        <w:ind w:left="0"/>
       </w:pPr>
       <w:r>
         <w:rPr>
@@ -356,7 +345,6 @@
     <w:p>
       <w:pPr>
         <w:spacing w:after="100"/>
-        <w:ind w:left="0"/>
       </w:pPr>
       <w:r>
         <w:rPr>
@@ -371,7 +359,7 @@
         <w:rPr>
           <w:vertAlign w:val="superscript"/>
         </w:rPr>
-        <w:t>17,18,19</w:t>
+        <w:t>11–13</w:t>
       </w:r>
       <w:r>
         <w:t>, and neural regulation is variably associated with immune and stromal state across gastrointestinal tumour types</w:t>
@@ -380,7 +368,7 @@
         <w:rPr>
           <w:vertAlign w:val="superscript"/>
         </w:rPr>
-        <w:t>24</w:t>
+        <w:t>6</w:t>
       </w:r>
       <w:r>
         <w:t>. Spatial profiling of diagnostic and prognostic markers in the same tumours shows that marker-level readouts conceal substantial regional heterogeneity</w:t>
@@ -389,7 +377,7 @@
         <w:rPr>
           <w:vertAlign w:val="superscript"/>
         </w:rPr>
-        <w:t>10</w:t>
+        <w:t>3</w:t>
       </w:r>
       <w:r>
         <w:t>.</w:t>
@@ -398,7 +386,6 @@
     <w:p>
       <w:pPr>
         <w:spacing w:after="100"/>
-        <w:ind w:left="0"/>
       </w:pPr>
       <w:r>
         <w:rPr>
@@ -413,7 +400,6 @@
     <w:p>
       <w:pPr>
         <w:spacing w:after="100"/>
-        <w:ind w:left="0"/>
       </w:pPr>
       <w:r>
         <w:rPr>
@@ -428,7 +414,7 @@
         <w:rPr>
           <w:vertAlign w:val="superscript"/>
         </w:rPr>
-        <w:t>3,5</w:t>
+        <w:t>14,15</w:t>
       </w:r>
       <w:r>
         <w:t xml:space="preserve"> in an archival cohort with linked outcome, using the liver metastasis material where the spatial architecture is already characterised</w:t>
@@ -437,7 +423,7 @@
         <w:rPr>
           <w:vertAlign w:val="superscript"/>
         </w:rPr>
-        <w:t>7,8</w:t>
+        <w:t>1,2</w:t>
       </w:r>
       <w:r>
         <w:t>, and test whether the association with outcome survives adjustment for perineural immune composition. Where gene-level measurement cannot separate functionally divergent receptor variants, junction-spanning padlocks resolve them</w:t>
@@ -446,7 +432,7 @@
         <w:rPr>
           <w:vertAlign w:val="superscript"/>
         </w:rPr>
-        <w:t>2</w:t>
+        <w:t>20</w:t>
       </w:r>
       <w:r>
         <w:t>.</w:t>
@@ -455,7 +441,6 @@
     <w:p>
       <w:pPr>
         <w:spacing w:after="100"/>
-        <w:ind w:left="0"/>
       </w:pPr>
       <w:r>
         <w:rPr>
@@ -483,7 +468,6 @@
     <w:p>
       <w:pPr>
         <w:spacing w:after="100"/>
-        <w:ind w:left="0"/>
       </w:pPr>
       <w:r>
         <w:rPr>
@@ -507,7 +491,7 @@
         <w:rPr>
           <w:vertAlign w:val="superscript"/>
         </w:rPr>
-        <w:t>24</w:t>
+        <w:t>6</w:t>
       </w:r>
       <w:r>
         <w:t>. The lab has assembled organ-wide developmental atlases and mapped the cellular evolution of neuroinflammatory lesions</w:t>
@@ -516,7 +500,7 @@
         <w:rPr>
           <w:vertAlign w:val="superscript"/>
         </w:rPr>
-        <w:t>12,16</w:t>
+        <w:t>4,24</w:t>
       </w:r>
       <w:r>
         <w:t>.</w:t>
@@ -525,7 +509,6 @@
     <w:p>
       <w:pPr>
         <w:spacing w:after="100"/>
-        <w:ind w:left="0"/>
       </w:pPr>
       <w:r>
         <w:rPr>
@@ -540,7 +523,6 @@
     <w:p>
       <w:pPr>
         <w:spacing w:after="100"/>
-        <w:ind w:left="0"/>
       </w:pPr>
       <w:r>
         <w:rPr>
@@ -555,7 +537,7 @@
         <w:rPr>
           <w:vertAlign w:val="superscript"/>
         </w:rPr>
-        <w:t>5,13</w:t>
+        <w:t>5,15</w:t>
       </w:r>
       <w:r>
         <w:t>, comparing tumour perineural niches against genuine nerve injury and against multiple sclerosis lesion material as a non-malignant injury reference where the lesion evolution is already mapped</w:t>
@@ -564,7 +546,7 @@
         <w:rPr>
           <w:vertAlign w:val="superscript"/>
         </w:rPr>
-        <w:t>12</w:t>
+        <w:t>4</w:t>
       </w:r>
       <w:r>
         <w:t>. Where the distinguishing information is carried by transcript variants rather than transcript levels, isoform-resolved and editing-resolved padlock readouts provide it</w:t>
@@ -573,7 +555,7 @@
         <w:rPr>
           <w:vertAlign w:val="superscript"/>
         </w:rPr>
-        <w:t>2,15</w:t>
+        <w:t>20,25</w:t>
       </w:r>
       <w:r>
         <w:t>.</w:t>
@@ -582,7 +564,6 @@
     <w:p>
       <w:pPr>
         <w:spacing w:after="100"/>
-        <w:ind w:left="0"/>
       </w:pPr>
       <w:r>
         <w:rPr>
@@ -610,7 +591,6 @@
     <w:p>
       <w:pPr>
         <w:spacing w:after="100"/>
-        <w:ind w:left="0"/>
       </w:pPr>
       <w:r>
         <w:rPr>
@@ -625,7 +605,7 @@
         <w:rPr>
           <w:vertAlign w:val="superscript"/>
         </w:rPr>
-        <w:t>17,18,19,22</w:t>
+        <w:t>8,11–13</w:t>
       </w:r>
       <w:r>
         <w:t>. Neurons also release vesicular cargo including small and circular RNAs; circular RNAs are enriched in neural tissue and are detectable in situ</w:t>
@@ -634,7 +614,7 @@
         <w:rPr>
           <w:vertAlign w:val="superscript"/>
         </w:rPr>
-        <w:t>14</w:t>
+        <w:t>26</w:t>
       </w:r>
       <w:r>
         <w:t>, and transcript-level regulation such as RNA editing is spatially patterned in the nervous system</w:t>
@@ -643,7 +623,7 @@
         <w:rPr>
           <w:vertAlign w:val="superscript"/>
         </w:rPr>
-        <w:t>15</w:t>
+        <w:t>25</w:t>
       </w:r>
       <w:r>
         <w:t>.</w:t>
@@ -652,7 +632,6 @@
     <w:p>
       <w:pPr>
         <w:spacing w:after="100"/>
-        <w:ind w:left="0"/>
       </w:pPr>
       <w:r>
         <w:rPr>
@@ -667,7 +646,6 @@
     <w:p>
       <w:pPr>
         <w:spacing w:after="100"/>
-        <w:ind w:left="0"/>
       </w:pPr>
       <w:r>
         <w:rPr>
@@ -682,7 +660,7 @@
         <w:rPr>
           <w:vertAlign w:val="superscript"/>
         </w:rPr>
-        <w:t>2,14</w:t>
+        <w:t>20,26</w:t>
       </w:r>
       <w:r>
         <w:t>, combined with donor-versus-recipient genotype discrimination so that a donor-genotype signal scored within a recipient cell constitutes sequence level evidence of transfer</w:t>
@@ -691,7 +669,7 @@
         <w:rPr>
           <w:vertAlign w:val="superscript"/>
         </w:rPr>
-        <w:t>2,11</w:t>
+        <w:t>20,22</w:t>
       </w:r>
       <w:r>
         <w:t>. Calibration against mechanistically unrelated contact and transfer reporters</w:t>
@@ -700,7 +678,7 @@
         <w:rPr>
           <w:vertAlign w:val="superscript"/>
         </w:rPr>
-        <w:t>26,27,28,29</w:t>
+        <w:t>27–30</w:t>
       </w:r>
       <w:r>
         <w:t xml:space="preserve"> is what separates transfer from uptake of debris, and it dominates the first year.</w:t>
@@ -709,7 +687,6 @@
     <w:p>
       <w:pPr>
         <w:spacing w:after="100"/>
-        <w:ind w:left="0"/>
       </w:pPr>
       <w:r>
         <w:rPr>
@@ -750,7 +727,7 @@
         <w:rPr>
           <w:sz w:val="18"/>
         </w:rPr>
-        <w:t>Nilsson, M. et al. Science 265, 2085–2088 (1994). doi:10.1126/science.7522346</w:t>
+        <w:t>Andersson, A. et al. Clin. Cancer Res. 30, 4517–4529 (2024). doi:10.1158/1078-0432.CCR-23-3461</w:t>
       </w:r>
     </w:p>
     <w:p>
@@ -769,7 +746,7 @@
         <w:rPr>
           <w:sz w:val="18"/>
         </w:rPr>
-        <w:t>Larsson, C. et al. Nat. Methods 7, 395–397 (2010). doi:10.1038/nmeth.1448</w:t>
+        <w:t>Escriva Conde, M. et al. Br. J. Cancer (2026). doi:10.1038/s41416-026-03567-y</w:t>
       </w:r>
     </w:p>
     <w:p>
@@ -788,7 +765,7 @@
         <w:rPr>
           <w:sz w:val="18"/>
         </w:rPr>
-        <w:t>Ke, R. et al. Nat. Methods 10, 857–860 (2013). doi:10.1038/nmeth.2563</w:t>
+        <w:t>Svedlund, J. et al. EBioMedicine 48, 212–223 (2019). doi:10.1016/j.ebiom.2019.09.009</w:t>
       </w:r>
     </w:p>
     <w:p>
@@ -807,7 +784,7 @@
         <w:rPr>
           <w:sz w:val="18"/>
         </w:rPr>
-        <w:t>Söderberg, O. et al. Nat. Methods 3, 995–1000 (2006). doi:10.1038/nmeth947</w:t>
+        <w:t>Kukanja, P. et al. Cell 187, 1990–2009 (2024). doi:10.1016/j.cell.2024.02.030</w:t>
       </w:r>
     </w:p>
     <w:p>
@@ -826,7 +803,7 @@
         <w:rPr>
           <w:sz w:val="18"/>
         </w:rPr>
-        <w:t>Gyllborg, D. et al. Nucleic Acids Res. 48, e112 (2020). doi:10.1093/nar/gkaa792</w:t>
+        <w:t>Langseth, C. M. et al. Commun. Biol. 4, 998 (2021). doi:10.1038/s42003-021-02517-z</w:t>
       </w:r>
     </w:p>
     <w:p>
@@ -845,7 +822,7 @@
         <w:rPr>
           <w:sz w:val="18"/>
         </w:rPr>
-        <w:t>Magoulopoulou, A. et al. Annu. Rev. Genomics Hum. Genet. 24, 133–150 (2023). doi:10.1146/annurev-genom-102722-092013</w:t>
+        <w:t>Jiang, H. et al. Front. Immunol. 17, 1916481 (2026). doi:10.3389/fimmu.2026.1916481</w:t>
       </w:r>
     </w:p>
     <w:p>
@@ -864,7 +841,7 @@
         <w:rPr>
           <w:sz w:val="18"/>
         </w:rPr>
-        <w:t>Andersson, A. et al. Clin. Cancer Res. 30, 4517–4529 (2024). doi:10.1158/1078-0432.CCR-23-3461</w:t>
+        <w:t>Hanahan, D. Cell 189, 2254–2277 (2026). doi:10.1016/j.cell.2025.12.049</w:t>
       </w:r>
     </w:p>
     <w:p>
@@ -883,7 +860,7 @@
         <w:rPr>
           <w:sz w:val="18"/>
         </w:rPr>
-        <w:t>Escriva Conde, M. et al. Br. J. Cancer (2026). doi:10.1038/s41416-026-03567-y</w:t>
+        <w:t>Globig, A.-M. et al. Nature 622, 383–392 (2023). doi:10.1038/s41586-023-06568-6</w:t>
       </w:r>
     </w:p>
     <w:p>
@@ -902,7 +879,7 @@
         <w:rPr>
           <w:sz w:val="18"/>
         </w:rPr>
-        <w:t>Magoulopoulou, A. et al. EBioMedicine 127, 106264 (2026). doi:10.1016/j.ebiom.2026.106264</w:t>
+        <w:t>Balood, M. et al. Nature 611, 405–412 (2022). doi:10.1038/s41586-022-05374-w</w:t>
       </w:r>
     </w:p>
     <w:p>
@@ -921,7 +898,7 @@
         <w:rPr>
           <w:sz w:val="18"/>
         </w:rPr>
-        <w:t>Svedlund, J. et al. EBioMedicine 48, 212–223 (2019). doi:10.1016/j.ebiom.2019.09.009</w:t>
+        <w:t>Restaino, A. C. et al. Sci. Signal. 18, eads7889 (2025). doi:10.1126/scisignal.ads7889</w:t>
       </w:r>
     </w:p>
     <w:p>
@@ -940,7 +917,7 @@
         <w:rPr>
           <w:sz w:val="18"/>
         </w:rPr>
-        <w:t>Lomakin, A. et al. Nature 611, 594–602 (2022). doi:10.1038/s41586-022-05425-2</w:t>
+        <w:t>Magnon, C. et al. Science 341, 1236361 (2013). doi:10.1126/science.1236361</w:t>
       </w:r>
     </w:p>
     <w:p>
@@ -959,7 +936,7 @@
         <w:rPr>
           <w:sz w:val="18"/>
         </w:rPr>
-        <w:t>Kukanja, P. et al. Cell 187, 1990–2009 (2024). doi:10.1016/j.cell.2024.02.030</w:t>
+        <w:t>Zahalka, A. H. et al. Science 358, 321–326 (2017). doi:10.1126/science.aah5072</w:t>
       </w:r>
     </w:p>
     <w:p>
@@ -978,7 +955,7 @@
         <w:rPr>
           <w:sz w:val="18"/>
         </w:rPr>
-        <w:t>Langseth, C. M. et al. Commun. Biol. 4, 998 (2021). doi:10.1038/s42003-021-02517-z</w:t>
+        <w:t>Renz, B. W. et al. Cancer Cell 34, 863–867 (2018). doi:10.1016/j.ccell.2018.10.010</w:t>
       </w:r>
     </w:p>
     <w:p>
@@ -997,7 +974,7 @@
         <w:rPr>
           <w:sz w:val="18"/>
         </w:rPr>
-        <w:t>Zaghlool, A. et al. Sci. Rep. 8, 16953 (2018). doi:10.1038/s41598-018-35001-6</w:t>
+        <w:t>Ke, R. et al. Nat. Methods 10, 857–860 (2013). doi:10.1038/nmeth.2563</w:t>
       </w:r>
     </w:p>
     <w:p>
@@ -1016,7 +993,7 @@
         <w:rPr>
           <w:sz w:val="18"/>
         </w:rPr>
-        <w:t>Lundin, E. et al. BMC Biol. 18, 6 (2020). doi:10.1186/s12915-019-0736-3</w:t>
+        <w:t>Gyllborg, D. et al. Nucleic Acids Res. 48, e112 (2020). doi:10.1093/nar/gkaa792</w:t>
       </w:r>
     </w:p>
     <w:p>
@@ -1035,7 +1012,7 @@
         <w:rPr>
           <w:sz w:val="18"/>
         </w:rPr>
-        <w:t>Asp, M. et al. Cell 179, 1647–1660 (2019). doi:10.1016/j.cell.2019.11.025</w:t>
+        <w:t>Magoulopoulou, A. et al. Annu. Rev. Genomics Hum. Genet. 24, 133–150 (2023). doi:10.1146/annurev-genom-102722-092013</w:t>
       </w:r>
     </w:p>
     <w:p>
@@ -1054,7 +1031,7 @@
         <w:rPr>
           <w:sz w:val="18"/>
         </w:rPr>
-        <w:t>Magnon, C. et al. Science 341, 1236361 (2013). doi:10.1126/science.1236361</w:t>
+        <w:t>Magoulopoulou, A. et al. EBioMedicine 127, 106264 (2026). doi:10.1016/j.ebiom.2026.106264</w:t>
       </w:r>
     </w:p>
     <w:p>
@@ -1073,7 +1050,7 @@
         <w:rPr>
           <w:sz w:val="18"/>
         </w:rPr>
-        <w:t>Zahalka, A. H. et al. Science 358, 321–326 (2017). doi:10.1126/science.aah5072</w:t>
+        <w:t>Söderberg, O. et al. Nat. Methods 3, 995–1000 (2006). doi:10.1038/nmeth947</w:t>
       </w:r>
     </w:p>
     <w:p>
@@ -1092,7 +1069,7 @@
         <w:rPr>
           <w:sz w:val="18"/>
         </w:rPr>
-        <w:t>Renz, B. W. et al. Cancer Cell 34, 863–867 (2018). doi:10.1016/j.ccell.2018.10.010</w:t>
+        <w:t>Nilsson, M. et al. Science 265, 2085–2088 (1994). doi:10.1126/science.7522346</w:t>
       </w:r>
     </w:p>
     <w:p>
@@ -1111,7 +1088,7 @@
         <w:rPr>
           <w:sz w:val="18"/>
         </w:rPr>
-        <w:t>Balood, M. et al. Nature 611, 405–412 (2022). doi:10.1038/s41586-022-05374-w</w:t>
+        <w:t>Larsson, C. et al. Nat. Methods 7, 395–397 (2010). doi:10.1038/nmeth.1448</w:t>
       </w:r>
     </w:p>
     <w:p>
@@ -1130,7 +1107,7 @@
         <w:rPr>
           <w:sz w:val="18"/>
         </w:rPr>
-        <w:t>Restaino, A. C. et al. Sci. Signal. 18, eads7889 (2025). doi:10.1126/scisignal.ads7889</w:t>
+        <w:t>Muntjewerff, E. M., Josyula, V. S., Lehmair, F. &amp; Christoffersson, G. Front. Immunol. 16, 1654382 (2025). doi:10.3389/fimmu.2025.1654382</w:t>
       </w:r>
     </w:p>
     <w:p>
@@ -1149,7 +1126,7 @@
         <w:rPr>
           <w:sz w:val="18"/>
         </w:rPr>
-        <w:t>Globig, A.-M. et al. Nature 622, 383–392 (2023). doi:10.1038/s41586-023-06568-6</w:t>
+        <w:t>Lomakin, A. et al. Nature 611, 594–602 (2022). doi:10.1038/s41586-022-05425-2</w:t>
       </w:r>
     </w:p>
     <w:p>
@@ -1187,7 +1164,7 @@
         <w:rPr>
           <w:sz w:val="18"/>
         </w:rPr>
-        <w:t>Jiang, H. et al. Front. Immunol. 17, 1916481 (2026). doi:10.3389/fimmu.2026.1916481</w:t>
+        <w:t>Asp, M. et al. Cell 179, 1647–1660 (2019). doi:10.1016/j.cell.2019.11.025</w:t>
       </w:r>
     </w:p>
     <w:p>
@@ -1206,7 +1183,7 @@
         <w:rPr>
           <w:sz w:val="18"/>
         </w:rPr>
-        <w:t>Hanahan, D. Cell 189, 2254–2277 (2026). doi:10.1016/j.cell.2025.12.049</w:t>
+        <w:t>Lundin, E. et al. BMC Biol. 18, 6 (2020). doi:10.1186/s12915-019-0736-3</w:t>
       </w:r>
     </w:p>
     <w:p>
@@ -1225,7 +1202,7 @@
         <w:rPr>
           <w:sz w:val="18"/>
         </w:rPr>
-        <w:t>Pasqual, G. et al. Nature 553, 496–500 (2018). doi:10.1038/nature25442</w:t>
+        <w:t>Zaghlool, A. et al. Sci. Rep. 8, 16953 (2018). doi:10.1038/s41598-018-35001-6</w:t>
       </w:r>
     </w:p>
     <w:p>
@@ -1244,7 +1221,7 @@
         <w:rPr>
           <w:sz w:val="18"/>
         </w:rPr>
-        <w:t>Canesso, M. C. C. et al. Science 387, eado5088 (2025). doi:10.1126/science.ado5088</w:t>
+        <w:t>Pasqual, G. et al. Nature 553, 496–500 (2018). doi:10.1038/nature25442</w:t>
       </w:r>
     </w:p>
     <w:p>
@@ -1263,7 +1240,7 @@
         <w:rPr>
           <w:sz w:val="18"/>
         </w:rPr>
-        <w:t>Roybal, K. T. et al. Cell 167, 419–432 (2016). doi:10.1016/j.cell.2016.09.011</w:t>
+        <w:t>Canesso, M. C. C. et al. Science 387, eado5088 (2025). doi:10.1126/science.ado5088</w:t>
       </w:r>
     </w:p>
     <w:p>
@@ -1282,7 +1259,7 @@
         <w:rPr>
           <w:sz w:val="18"/>
         </w:rPr>
-        <w:t>Toda, S. et al. Science 361, 156–162 (2018). doi:10.1126/science.aat0271</w:t>
+        <w:t>Roybal, K. T. et al. Cell 167, 419–432 (2016). doi:10.1016/j.cell.2016.09.011</w:t>
       </w:r>
     </w:p>
     <w:p>
@@ -1301,7 +1278,7 @@
         <w:rPr>
           <w:sz w:val="18"/>
         </w:rPr>
-        <w:t>Muntjewerff, E. M., Josyula, V. S., Lehmair, F. &amp; Christoffersson, G. Front. Immunol. 16, 1654382 (2025). doi:10.3389/fimmu.2025.1654382</w:t>
+        <w:t>Toda, S. et al. Science 361, 156–162 (2018). doi:10.1126/science.aat0271</w:t>
       </w:r>
     </w:p>
     <w:p>
@@ -1313,7 +1290,7 @@
           <w:i/>
           <w:sz w:val="18"/>
         </w:rPr>
-        <w:t>References retrieved via PubMed.</w:t>
+        <w:t>References numbered in order of first citation; retrieved via PubMed.</w:t>
       </w:r>
     </w:p>
     <w:sectPr>

</xml_diff>